<commit_message>
cambios en algunos campos del dashboard web
</commit_message>
<xml_diff>
--- a/docs/Borrador v1 Proyecto Sistemas Embebidos.docx
+++ b/docs/Borrador v1 Proyecto Sistemas Embebidos.docx
@@ -10,20 +10,6 @@
           <w:rFonts w:ascii="Times New Roman" w:hAnsi="Times New Roman"/>
           <w:b/>
           <w:bCs/>
-          <w:sz w:val="28"/>
-          <w:szCs w:val="28"/>
-          <w:lang w:val="es-ES"/>
-        </w:rPr>
-      </w:pPr>
-    </w:p>
-    <w:p>
-      <w:pPr>
-        <w:jc w:val="center"/>
-        <w:outlineLvl w:val="0"/>
-        <w:rPr>
-          <w:rFonts w:ascii="Times New Roman" w:hAnsi="Times New Roman"/>
-          <w:b/>
-          <w:bCs/>
           <w:spacing w:val="-4"/>
           <w:w w:val="99"/>
           <w:sz w:val="24"/>
@@ -214,164 +200,6 @@
           <w:lang w:val="es-ES" w:eastAsia="en-US"/>
         </w:rPr>
         <w:t>2</w:t>
-      </w:r>
-    </w:p>
-    <w:p>
-      <w:pPr>
-        <w:jc w:val="center"/>
-        <w:rPr>
-          <w:rFonts w:ascii="Times New Roman" w:eastAsia="Times New Roman" w:hAnsi="Times New Roman"/>
-          <w:spacing w:val="-6"/>
-          <w:kern w:val="0"/>
-          <w:sz w:val="24"/>
-          <w:szCs w:val="24"/>
-          <w:vertAlign w:val="superscript"/>
-          <w:lang w:val="es-ES" w:eastAsia="en-US"/>
-        </w:rPr>
-      </w:pPr>
-    </w:p>
-    <w:p>
-      <w:pPr>
-        <w:jc w:val="center"/>
-        <w:outlineLvl w:val="1"/>
-        <w:rPr>
-          <w:rFonts w:ascii="Times New Roman" w:hAnsi="Times New Roman"/>
-          <w:b/>
-          <w:bCs/>
-          <w:spacing w:val="-4"/>
-          <w:w w:val="99"/>
-          <w:lang w:val="es-419"/>
-        </w:rPr>
-      </w:pPr>
-      <w:r>
-        <w:rPr>
-          <w:rFonts w:ascii="Times New Roman" w:hAnsi="Times New Roman"/>
-          <w:b/>
-          <w:bCs/>
-          <w:spacing w:val="-4"/>
-          <w:w w:val="99"/>
-          <w:lang w:val="es-419"/>
-        </w:rPr>
-        <w:t>Resumen</w:t>
-      </w:r>
-    </w:p>
-    <w:p>
-      <w:pPr>
-        <w:ind w:left="862" w:right="1219"/>
-        <w:rPr>
-          <w:rFonts w:ascii="Times New Roman" w:hAnsi="Times New Roman"/>
-          <w:spacing w:val="-4"/>
-          <w:w w:val="99"/>
-          <w:lang w:val="es-419"/>
-        </w:rPr>
-      </w:pPr>
-    </w:p>
-    <w:p>
-      <w:pPr>
-        <w:ind w:left="862" w:right="1219"/>
-        <w:rPr>
-          <w:rFonts w:ascii="Times New Roman" w:hAnsi="Times New Roman"/>
-          <w:b/>
-          <w:bCs/>
-          <w:spacing w:val="-4"/>
-          <w:w w:val="99"/>
-          <w:lang w:val="es-419"/>
-        </w:rPr>
-      </w:pPr>
-      <w:r>
-        <w:rPr>
-          <w:rFonts w:ascii="Times New Roman" w:hAnsi="Times New Roman"/>
-          <w:b/>
-          <w:bCs/>
-          <w:spacing w:val="-4"/>
-          <w:w w:val="99"/>
-          <w:lang w:val="es-419"/>
-        </w:rPr>
-        <w:t>Palabras clave:</w:t>
-      </w:r>
-    </w:p>
-    <w:p>
-      <w:pPr>
-        <w:ind w:left="862" w:right="1219"/>
-        <w:rPr>
-          <w:rFonts w:ascii="Times New Roman" w:hAnsi="Times New Roman"/>
-          <w:b/>
-          <w:bCs/>
-          <w:spacing w:val="-4"/>
-          <w:w w:val="99"/>
-          <w:lang w:val="es-419"/>
-        </w:rPr>
-      </w:pPr>
-    </w:p>
-    <w:p>
-      <w:pPr>
-        <w:jc w:val="center"/>
-        <w:outlineLvl w:val="1"/>
-        <w:rPr>
-          <w:rFonts w:ascii="Times New Roman" w:hAnsi="Times New Roman"/>
-          <w:b/>
-          <w:bCs/>
-          <w:spacing w:val="-4"/>
-          <w:w w:val="99"/>
-          <w:lang w:val="es-419"/>
-        </w:rPr>
-      </w:pPr>
-      <w:r>
-        <w:rPr>
-          <w:rFonts w:ascii="Times New Roman" w:hAnsi="Times New Roman"/>
-          <w:b/>
-          <w:bCs/>
-          <w:spacing w:val="-4"/>
-          <w:w w:val="99"/>
-          <w:lang w:val="es-419"/>
-        </w:rPr>
-        <w:t>Abstract</w:t>
-      </w:r>
-    </w:p>
-    <w:p>
-      <w:pPr>
-        <w:ind w:left="862" w:right="1219"/>
-        <w:rPr>
-          <w:rFonts w:ascii="Times New Roman" w:hAnsi="Times New Roman"/>
-          <w:spacing w:val="-4"/>
-          <w:w w:val="99"/>
-          <w:lang w:val="es-419"/>
-        </w:rPr>
-      </w:pPr>
-    </w:p>
-    <w:p>
-      <w:pPr>
-        <w:ind w:left="862" w:right="1219"/>
-        <w:rPr>
-          <w:rFonts w:ascii="Times New Roman" w:hAnsi="Times New Roman"/>
-          <w:b/>
-          <w:bCs/>
-          <w:spacing w:val="-4"/>
-          <w:w w:val="99"/>
-          <w:lang w:val="es-419"/>
-        </w:rPr>
-      </w:pPr>
-      <w:r>
-        <w:rPr>
-          <w:rFonts w:ascii="Times New Roman" w:hAnsi="Times New Roman"/>
-          <w:b/>
-          <w:bCs/>
-          <w:spacing w:val="-4"/>
-          <w:w w:val="99"/>
-          <w:lang w:val="es-419"/>
-        </w:rPr>
-        <w:t>Keywords</w:t>
-      </w:r>
-      <w:r>
-        <w:rPr>
-          <w:rFonts w:ascii="Times New Roman" w:hAnsi="Times New Roman"/>
-          <w:b/>
-          <w:bCs/>
-          <w:spacing w:val="-4"/>
-          <w:w w:val="99"/>
-          <w:lang w:val="es-419"/>
-        </w:rPr>
-        <w:t>:</w:t>
       </w:r>
     </w:p>
     <w:p>
@@ -480,7 +308,31 @@
         <w:rPr>
           <w:lang w:val="es-419"/>
         </w:rPr>
-        <w:t>En este contexto, el presente trabajo describe el desarrollo de Smart-Plant, un sistema de monitoreo y riego automático de plantas basado en IoT, cuyo objetivo es detectar en tiempo real la condición de humedad del suelo y activar el riego de manera autónoma cuando sea necesario. El sistema integra hardware de bajo costo y consumo (módulos ESP32) con tecnologías de comunicación estándar en IoT (protocolo MQTT) y una arquitectura de software escalable (Node.js, MongoDB), accesible a través de un dashboard web.</w:t>
+        <w:t xml:space="preserve">En este contexto, el presente trabajo describe el desarrollo de Smart-Plant, un sistema de monitoreo y riego automático de plantas basado en IoT, cuyo objetivo es </w:t>
+      </w:r>
+      <w:r>
+        <w:rPr>
+          <w:lang w:val="es-419"/>
+        </w:rPr>
+        <w:t xml:space="preserve">medir variables ambientales y </w:t>
+      </w:r>
+      <w:r>
+        <w:rPr>
+          <w:lang w:val="es-419"/>
+        </w:rPr>
+        <w:t xml:space="preserve">detectar en tiempo real la condición de humedad del suelo </w:t>
+      </w:r>
+      <w:r>
+        <w:rPr>
+          <w:lang w:val="es-419"/>
+        </w:rPr>
+        <w:t>para</w:t>
+      </w:r>
+      <w:r>
+        <w:rPr>
+          <w:lang w:val="es-419"/>
+        </w:rPr>
+        <w:t xml:space="preserve"> activar el riego de manera autónoma cuando sea necesario. El sistema integra hardware de bajo costo y consumo (módulos ESP32) con tecnologías de comunicación estándar en IoT (protocolo MQTT) y una arquitectura de software escalable (Node.js, MongoDB), accesible a través de un dashboard web.</w:t>
       </w:r>
     </w:p>
     <w:p>
@@ -529,23 +381,323 @@
     </w:p>
     <w:p>
       <w:pPr>
-        <w:ind w:left="646"/>
-        <w:rPr>
-          <w:rFonts w:ascii="Times New Roman" w:hAnsi="Times New Roman"/>
-          <w:sz w:val="24"/>
-          <w:szCs w:val="28"/>
-        </w:rPr>
-      </w:pPr>
-    </w:p>
-    <w:p>
-      <w:pPr>
-        <w:ind w:left="289"/>
-        <w:rPr>
-          <w:rFonts w:ascii="Times New Roman" w:hAnsi="Times New Roman"/>
-          <w:sz w:val="24"/>
-          <w:szCs w:val="28"/>
-        </w:rPr>
-      </w:pPr>
+        <w:ind w:left="289" w:right="646" w:firstLine="357"/>
+        <w:rPr>
+          <w:rFonts w:ascii="Times New Roman" w:hAnsi="Times New Roman"/>
+          <w:sz w:val="24"/>
+          <w:szCs w:val="28"/>
+          <w:lang w:val="es-419"/>
+        </w:rPr>
+      </w:pPr>
+      <w:r>
+        <w:rPr>
+          <w:rFonts w:ascii="Times New Roman" w:hAnsi="Times New Roman"/>
+          <w:sz w:val="24"/>
+          <w:szCs w:val="28"/>
+          <w:lang w:val="es-419"/>
+        </w:rPr>
+        <w:t>El cuidado de plantas en entornos domésticos y de oficina frecuentemente se ve comprometido por la falta de tiempo, el desconocimiento de las necesidades</w:t>
+      </w:r>
+      <w:r>
+        <w:rPr>
+          <w:rFonts w:ascii="Times New Roman" w:hAnsi="Times New Roman"/>
+          <w:sz w:val="24"/>
+          <w:szCs w:val="28"/>
+          <w:lang w:val="es-419"/>
+        </w:rPr>
+        <w:t xml:space="preserve"> hídricas y ambientales</w:t>
+      </w:r>
+      <w:r>
+        <w:rPr>
+          <w:rFonts w:ascii="Times New Roman" w:hAnsi="Times New Roman"/>
+          <w:sz w:val="24"/>
+          <w:szCs w:val="28"/>
+          <w:lang w:val="es-419"/>
+        </w:rPr>
+        <w:t xml:space="preserve"> específicas de cada </w:t>
+      </w:r>
+      <w:r>
+        <w:rPr>
+          <w:rFonts w:ascii="Times New Roman" w:hAnsi="Times New Roman"/>
+          <w:sz w:val="24"/>
+          <w:szCs w:val="28"/>
+          <w:lang w:val="es-419"/>
+        </w:rPr>
+        <w:t>planta</w:t>
+      </w:r>
+      <w:r>
+        <w:rPr>
+          <w:rFonts w:ascii="Times New Roman" w:hAnsi="Times New Roman"/>
+          <w:sz w:val="24"/>
+          <w:szCs w:val="28"/>
+          <w:lang w:val="es-419"/>
+        </w:rPr>
+        <w:t xml:space="preserve"> o la ausencia prolongada de los usuarios. Esta situación no solo repercute negativamente en la salud y supervivencia de las plantas, sino que también promueve prácticas ineficientes como el riego excesivo, lo cual genera un desperdicio innecesario de agua. Aunque la agricultura de precisión ha demostrado cómo la tecnología puede optimizar el uso de recursos hídricos y mejorar las condiciones de crecimiento mediante sistemas autónomos, la adopción de estos mecanismos en el ámbito </w:t>
+      </w:r>
+      <w:r>
+        <w:rPr>
+          <w:rFonts w:ascii="Times New Roman" w:hAnsi="Times New Roman"/>
+          <w:sz w:val="24"/>
+          <w:szCs w:val="28"/>
+          <w:lang w:val="es-419"/>
+        </w:rPr>
+        <w:t>doméstico</w:t>
+      </w:r>
+      <w:r>
+        <w:rPr>
+          <w:rFonts w:ascii="Times New Roman" w:hAnsi="Times New Roman"/>
+          <w:sz w:val="24"/>
+          <w:szCs w:val="28"/>
+          <w:lang w:val="es-419"/>
+        </w:rPr>
+        <w:t xml:space="preserve"> aún es muy limitada.</w:t>
+      </w:r>
+    </w:p>
+    <w:p>
+      <w:pPr>
+        <w:ind w:left="289" w:right="646" w:firstLine="357"/>
+        <w:rPr>
+          <w:rFonts w:ascii="Times New Roman" w:hAnsi="Times New Roman"/>
+          <w:sz w:val="24"/>
+          <w:szCs w:val="28"/>
+          <w:lang w:val="es-419"/>
+        </w:rPr>
+      </w:pPr>
+      <w:r>
+        <w:rPr>
+          <w:rFonts w:ascii="Times New Roman" w:hAnsi="Times New Roman"/>
+          <w:sz w:val="24"/>
+          <w:szCs w:val="28"/>
+          <w:lang w:val="es-419"/>
+        </w:rPr>
+        <w:t>La revisión del estado del arte evidencia que la mayoría de los sistemas IoT actuales están fuertemente orientados a cultivos agrícolas a gran escala o invernaderos. Existe una carencia de soluciones domésticas que sean modulares, escalables y que ofrezcan una interfaz de usuario interactiva capaz de gestionar múltiples nodos simultáneamente y visualizar datos históricos</w:t>
+      </w:r>
+      <w:r>
+        <w:rPr>
+          <w:rFonts w:ascii="Times New Roman" w:hAnsi="Times New Roman"/>
+          <w:sz w:val="24"/>
+          <w:szCs w:val="28"/>
+          <w:lang w:val="es-419"/>
+        </w:rPr>
+        <w:t xml:space="preserve">. </w:t>
+      </w:r>
+    </w:p>
+    <w:p>
+      <w:pPr>
+        <w:ind w:left="289" w:right="646" w:firstLine="357"/>
+        <w:rPr>
+          <w:rFonts w:ascii="Times New Roman" w:hAnsi="Times New Roman"/>
+          <w:sz w:val="24"/>
+          <w:szCs w:val="28"/>
+          <w:lang w:val="es-419"/>
+        </w:rPr>
+      </w:pPr>
+      <w:r>
+        <w:rPr>
+          <w:rFonts w:ascii="Times New Roman" w:hAnsi="Times New Roman"/>
+          <w:sz w:val="24"/>
+          <w:szCs w:val="28"/>
+          <w:lang w:val="es-419"/>
+        </w:rPr>
+        <w:t>Además, a</w:t>
+      </w:r>
+      <w:r>
+        <w:rPr>
+          <w:rFonts w:ascii="Times New Roman" w:hAnsi="Times New Roman"/>
+          <w:sz w:val="24"/>
+          <w:szCs w:val="28"/>
+          <w:lang w:val="es-419"/>
+        </w:rPr>
+        <w:t xml:space="preserve"> diferencia de los sistemas convencionales orientados exclusivamente al control de riego, este proyecto incorpora un sensor multiparámetro capaz de adquirir datos en tiempo real de humedad, temperatura, y </w:t>
+      </w:r>
+      <w:r>
+        <w:rPr>
+          <w:rFonts w:ascii="Times New Roman" w:hAnsi="Times New Roman"/>
+          <w:sz w:val="24"/>
+          <w:szCs w:val="28"/>
+          <w:lang w:val="es-419"/>
+        </w:rPr>
+        <w:t>nutrientes</w:t>
+      </w:r>
+      <w:r>
+        <w:rPr>
+          <w:rFonts w:ascii="Times New Roman" w:hAnsi="Times New Roman"/>
+          <w:sz w:val="24"/>
+          <w:szCs w:val="28"/>
+          <w:lang w:val="es-419"/>
+        </w:rPr>
+        <w:t xml:space="preserve"> (nitrógeno, fósforo y potasio - NPK).</w:t>
+      </w:r>
+      <w:r>
+        <w:rPr>
+          <w:lang w:val="es-419"/>
+        </w:rPr>
+        <w:t xml:space="preserve"> </w:t>
+      </w:r>
+      <w:r>
+        <w:rPr>
+          <w:rFonts w:ascii="Times New Roman" w:hAnsi="Times New Roman"/>
+          <w:sz w:val="24"/>
+          <w:szCs w:val="28"/>
+          <w:lang w:val="es-419"/>
+        </w:rPr>
+        <w:t>Aunque la activación autónoma de la bomba</w:t>
+      </w:r>
+      <w:r>
+        <w:rPr>
+          <w:rFonts w:ascii="Times New Roman" w:hAnsi="Times New Roman"/>
+          <w:sz w:val="24"/>
+          <w:szCs w:val="28"/>
+          <w:lang w:val="es-419"/>
+        </w:rPr>
+        <w:t xml:space="preserve"> </w:t>
+      </w:r>
+      <w:r>
+        <w:rPr>
+          <w:rFonts w:ascii="Times New Roman" w:hAnsi="Times New Roman"/>
+          <w:sz w:val="24"/>
+          <w:szCs w:val="28"/>
+          <w:lang w:val="es-419"/>
+        </w:rPr>
+        <w:t xml:space="preserve">de agua </w:t>
+      </w:r>
+      <w:r>
+        <w:rPr>
+          <w:rFonts w:ascii="Times New Roman" w:hAnsi="Times New Roman"/>
+          <w:sz w:val="24"/>
+          <w:szCs w:val="28"/>
+          <w:lang w:val="es-419"/>
+        </w:rPr>
+        <w:t>depende únicamente de</w:t>
+      </w:r>
+      <w:r>
+        <w:rPr>
+          <w:rFonts w:ascii="Times New Roman" w:hAnsi="Times New Roman"/>
+          <w:sz w:val="24"/>
+          <w:szCs w:val="28"/>
+          <w:lang w:val="es-419"/>
+        </w:rPr>
+        <w:t xml:space="preserve"> los umbrales de humedad del suelo, la captura y procesamiento de las variables de pH, temperatura y NPK se justifican desde un enfoque preventivo y de diagnóstico</w:t>
+      </w:r>
+      <w:r>
+        <w:rPr>
+          <w:rFonts w:ascii="Times New Roman" w:hAnsi="Times New Roman"/>
+          <w:sz w:val="24"/>
+          <w:szCs w:val="28"/>
+          <w:lang w:val="es-419"/>
+        </w:rPr>
+        <w:t>.</w:t>
+      </w:r>
+    </w:p>
+    <w:p>
+      <w:pPr>
+        <w:ind w:left="289" w:right="646" w:firstLine="357"/>
+        <w:rPr>
+          <w:rFonts w:ascii="Times New Roman" w:hAnsi="Times New Roman"/>
+          <w:sz w:val="24"/>
+          <w:szCs w:val="28"/>
+          <w:lang w:val="es-419"/>
+        </w:rPr>
+      </w:pPr>
+      <w:r>
+        <w:rPr>
+          <w:rFonts w:ascii="Times New Roman" w:hAnsi="Times New Roman"/>
+          <w:sz w:val="24"/>
+          <w:szCs w:val="28"/>
+          <w:lang w:val="es-419"/>
+        </w:rPr>
+        <w:t xml:space="preserve">En este contexto, el desarrollo de Smart-Plant se justifica por la necesidad de </w:t>
+      </w:r>
+      <w:r>
+        <w:rPr>
+          <w:rFonts w:ascii="Times New Roman" w:hAnsi="Times New Roman"/>
+          <w:sz w:val="24"/>
+          <w:szCs w:val="28"/>
+          <w:lang w:val="es-419"/>
+        </w:rPr>
+        <w:t>facilitar</w:t>
+      </w:r>
+      <w:r>
+        <w:rPr>
+          <w:rFonts w:ascii="Times New Roman" w:hAnsi="Times New Roman"/>
+          <w:sz w:val="24"/>
+          <w:szCs w:val="28"/>
+          <w:lang w:val="es-419"/>
+        </w:rPr>
+        <w:t xml:space="preserve"> el acceso a tecnologías de monitoreo ambiental y actuación automatizada en espacios interiores</w:t>
+      </w:r>
+      <w:r>
+        <w:rPr>
+          <w:rFonts w:ascii="Times New Roman" w:hAnsi="Times New Roman"/>
+          <w:sz w:val="24"/>
+          <w:szCs w:val="28"/>
+          <w:lang w:val="es-419"/>
+        </w:rPr>
+        <w:t xml:space="preserve"> que</w:t>
+      </w:r>
+      <w:r>
+        <w:rPr>
+          <w:rFonts w:ascii="Times New Roman" w:hAnsi="Times New Roman"/>
+          <w:sz w:val="24"/>
+          <w:szCs w:val="28"/>
+          <w:lang w:val="es-419"/>
+        </w:rPr>
+        <w:t xml:space="preserve"> faciliten el mantenimiento hídrico de las plantas</w:t>
+      </w:r>
+      <w:r>
+        <w:rPr>
+          <w:rFonts w:ascii="Times New Roman" w:hAnsi="Times New Roman"/>
+          <w:sz w:val="24"/>
+          <w:szCs w:val="28"/>
+          <w:lang w:val="es-419"/>
+        </w:rPr>
+        <w:t xml:space="preserve"> y permita</w:t>
+      </w:r>
+      <w:r>
+        <w:rPr>
+          <w:rFonts w:ascii="Times New Roman" w:hAnsi="Times New Roman"/>
+          <w:sz w:val="24"/>
+          <w:szCs w:val="28"/>
+          <w:lang w:val="es-419"/>
+        </w:rPr>
+        <w:t>n al usuario tomar decisiones informadas sobre el estado de su planta</w:t>
+      </w:r>
+      <w:r>
+        <w:rPr>
+          <w:rFonts w:ascii="Times New Roman" w:hAnsi="Times New Roman"/>
+          <w:sz w:val="24"/>
+          <w:szCs w:val="28"/>
+          <w:lang w:val="es-419"/>
+        </w:rPr>
+        <w:t xml:space="preserve">. Al integrar plataformas de hardware de bajo costo y consumo, como el microcontrolador ESP32, con arquitecturas de comunicación estandarizadas basadas en el protocolo MQTT, el proyecto ofrece una alternativa accesible, modular y funcional para </w:t>
+      </w:r>
+      <w:r>
+        <w:rPr>
+          <w:rFonts w:ascii="Times New Roman" w:hAnsi="Times New Roman"/>
+          <w:sz w:val="24"/>
+          <w:szCs w:val="28"/>
+          <w:lang w:val="es-419"/>
+        </w:rPr>
+        <w:t xml:space="preserve">la mayoría de </w:t>
+      </w:r>
+      <w:r>
+        <w:rPr>
+          <w:rFonts w:ascii="Times New Roman" w:hAnsi="Times New Roman"/>
+          <w:sz w:val="24"/>
+          <w:szCs w:val="28"/>
+          <w:lang w:val="es-419"/>
+        </w:rPr>
+        <w:t>los usuarios</w:t>
+      </w:r>
+      <w:r>
+        <w:rPr>
+          <w:rFonts w:ascii="Times New Roman" w:hAnsi="Times New Roman"/>
+          <w:sz w:val="24"/>
+          <w:szCs w:val="28"/>
+          <w:lang w:val="es-419"/>
+        </w:rPr>
+        <w:t>.</w:t>
+      </w:r>
     </w:p>
     <w:p>
       <w:pPr>
@@ -567,6 +719,7 @@
           <w:b/>
           <w:bCs/>
         </w:rPr>
+        <w:lastRenderedPageBreak/>
         <w:t>Objetivos</w:t>
       </w:r>
     </w:p>
@@ -758,7 +911,6 @@
         <w:rPr>
           <w:lang w:val="es-419"/>
         </w:rPr>
-        <w:lastRenderedPageBreak/>
         <w:t>Crear una aplicación/dashboard que permita visualizar el histórico de riegos, el estado actual de las plantas, y que cuente con un control para activar el riego manualmente.</w:t>
       </w:r>
     </w:p>
@@ -1568,12 +1720,14 @@
       <w:r>
         <w:rPr>
           <w:rFonts w:ascii="Times New Roman" w:hAnsi="Times New Roman"/>
-          <w:spacing w:val="-4"/>
-          <w:w w:val="99"/>
-          <w:sz w:val="24"/>
-          <w:szCs w:val="28"/>
-          <w:lang w:val="es-419"/>
-        </w:rPr>
+          <w:noProof/>
+          <w:spacing w:val="-4"/>
+          <w:w w:val="99"/>
+          <w:sz w:val="24"/>
+          <w:szCs w:val="28"/>
+          <w:lang w:val="es-419"/>
+        </w:rPr>
+        <w:lastRenderedPageBreak/>
         <w:drawing>
           <wp:inline distT="0" distB="0" distL="0" distR="0" wp14:anchorId="3904EA57" wp14:editId="26881A8E">
             <wp:extent cx="4016818" cy="2973788"/>
@@ -2257,6 +2411,8 @@
           <w:lang w:val="es-419"/>
         </w:rPr>
       </w:pPr>
+      <w:commentRangeStart w:id="3"/>
+      <w:commentRangeStart w:id="4"/>
       <w:r>
         <w:rPr>
           <w:rFonts w:ascii="Times New Roman" w:hAnsi="Times New Roman"/>
@@ -2289,18 +2445,21 @@
           <w:szCs w:val="24"/>
           <w:lang w:val="es-419"/>
         </w:rPr>
-        <w:t xml:space="preserve">NPK + temperatura + humedad + conductividad </w:t>
-      </w:r>
-      <w:commentRangeStart w:id="3"/>
-      <w:r>
-        <w:rPr>
-          <w:rFonts w:ascii="Times New Roman" w:eastAsia="Times New Roman" w:hAnsi="Times New Roman"/>
+        <w:t>NPK + temperatura + humedad + conductividad eléctrica</w:t>
+      </w:r>
+      <w:commentRangeEnd w:id="4"/>
+      <w:r>
+        <w:rPr>
+          <w:rStyle w:val="CommentReference"/>
+          <w:rFonts w:ascii="Times New Roman" w:hAnsi="Times New Roman"/>
           <w:b/>
+          <w:spacing w:val="-4"/>
+          <w:w w:val="99"/>
           <w:sz w:val="24"/>
           <w:szCs w:val="24"/>
           <w:lang w:val="es-419"/>
         </w:rPr>
-        <w:t>eléctrica</w:t>
+        <w:commentReference w:id="4"/>
       </w:r>
       <w:commentRangeEnd w:id="3"/>
       <w:r>
@@ -2344,6 +2503,7 @@
           <w:szCs w:val="24"/>
           <w:lang w:val="es-419"/>
         </w:rPr>
+        <w:lastRenderedPageBreak/>
         <w:t>Se seleccionó un sensor multiparámetro capaz de medir nitrógeno, fósforo y potasio (NPK), además de humedad, temperatura y conductividad eléctrica del suelo. Estas variables son esenciales para evaluar el estado general de la planta, ya que permiten conocer tanto la disponibilidad de nutrientes como las condiciones ambientales y del sustrato donde se encuentra sembrada.</w:t>
       </w:r>
     </w:p>
@@ -2395,6 +2555,7 @@
           <w:lang w:val="es-419"/>
         </w:rPr>
       </w:pPr>
+      <w:commentRangeStart w:id="5"/>
       <w:r>
         <w:rPr>
           <w:rFonts w:ascii="Times New Roman" w:hAnsi="Times New Roman"/>
@@ -2439,6 +2600,20 @@
         </w:rPr>
         <w:t>)</w:t>
       </w:r>
+      <w:commentRangeEnd w:id="5"/>
+      <w:r>
+        <w:rPr>
+          <w:rStyle w:val="CommentReference"/>
+          <w:rFonts w:ascii="Times New Roman" w:hAnsi="Times New Roman"/>
+          <w:b/>
+          <w:spacing w:val="-4"/>
+          <w:w w:val="99"/>
+          <w:sz w:val="24"/>
+          <w:szCs w:val="24"/>
+          <w:lang w:val="es-419"/>
+        </w:rPr>
+        <w:commentReference w:id="5"/>
+      </w:r>
     </w:p>
     <w:p>
       <w:pPr>
@@ -2488,7 +2663,6 @@
           <w:szCs w:val="28"/>
           <w:lang w:val="es-419"/>
         </w:rPr>
-        <w:lastRenderedPageBreak/>
         <w:t xml:space="preserve">La bomba peristáltica fue elegida porque permite suministrar cantidades controladas de agua con mayor precisión, lo que resulta ideal para el cuidado de plantas. </w:t>
       </w:r>
       <w:r>
@@ -2889,6 +3063,7 @@
         <w:rPr>
           <w:noProof/>
         </w:rPr>
+        <w:lastRenderedPageBreak/>
         <w:drawing>
           <wp:inline distT="0" distB="0" distL="0" distR="0" wp14:anchorId="5974D215" wp14:editId="5E132DF7">
             <wp:extent cx="3617843" cy="2364756"/>
@@ -2953,7 +3128,6 @@
           <w:w w:val="99"/>
           <w:sz w:val="24"/>
           <w:szCs w:val="28"/>
-          <w:lang w:val="es-419"/>
         </w:rPr>
         <w:br/>
       </w:r>
@@ -2977,17 +3151,7 @@
           <w:sz w:val="24"/>
           <w:szCs w:val="28"/>
         </w:rPr>
-        <w:t xml:space="preserve">Tomado de </w:t>
-      </w:r>
-      <w:r>
-        <w:rPr>
-          <w:rFonts w:ascii="Times New Roman" w:hAnsi="Times New Roman"/>
-          <w:spacing w:val="-4"/>
-          <w:w w:val="99"/>
-          <w:sz w:val="24"/>
-          <w:szCs w:val="28"/>
-        </w:rPr>
-        <w:t>Introduction of Message Queue Telemetry Transport Protocol (MQTT)</w:t>
+        <w:t>Tomado de Introduction of Message Queue Telemetry Transport Protocol (MQTT)</w:t>
       </w:r>
       <w:r>
         <w:rPr>
@@ -3335,19 +3499,7 @@
           <w:szCs w:val="28"/>
           <w:lang w:val="es-419"/>
         </w:rPr>
-        <w:t xml:space="preserve"> y los entrega </w:t>
-      </w:r>
-      <w:r>
-        <w:rPr>
-          <w:rFonts w:ascii="Times New Roman" w:hAnsi="Times New Roman"/>
-          <w:spacing w:val="-4"/>
-          <w:w w:val="99"/>
-          <w:sz w:val="24"/>
-          <w:szCs w:val="28"/>
-          <w:lang w:val="es-419"/>
-        </w:rPr>
-        <w:lastRenderedPageBreak/>
-        <w:t>a los suscriptores en función de sus respectivas suscripciones</w:t>
+        <w:t xml:space="preserve"> y los entrega a los suscriptores en función de sus respectivas suscripciones</w:t>
       </w:r>
       <w:r>
         <w:rPr>
@@ -3446,7 +3598,7 @@
           <w:lang w:val="es-419"/>
         </w:rPr>
       </w:pPr>
-      <w:commentRangeStart w:id="4"/>
+      <w:commentRangeStart w:id="6"/>
       <w:r>
         <w:rPr>
           <w:rFonts w:ascii="Times New Roman" w:hAnsi="Times New Roman"/>
@@ -3460,7 +3612,7 @@
         </w:rPr>
         <w:t xml:space="preserve">Figura </w:t>
       </w:r>
-      <w:commentRangeEnd w:id="4"/>
+      <w:commentRangeEnd w:id="6"/>
       <w:r>
         <w:rPr>
           <w:rStyle w:val="CommentReference"/>
@@ -3473,7 +3625,7 @@
           <w:szCs w:val="28"/>
           <w:lang w:val="es-419"/>
         </w:rPr>
-        <w:commentReference w:id="4"/>
+        <w:commentReference w:id="6"/>
       </w:r>
       <w:r>
         <w:rPr>
@@ -3815,7 +3967,19 @@
           <w:szCs w:val="28"/>
           <w:lang w:val="es-419"/>
         </w:rPr>
-        <w:t xml:space="preserve">Soporta tres niveles de calidad de servicio: at most once (QoS 0), at least once (QoS 1) y exactly once (QoS 2). </w:t>
+        <w:t xml:space="preserve">Soporta tres niveles de calidad de servicio: at most once (QoS 0), at least once (QoS 1) y </w:t>
+      </w:r>
+      <w:r>
+        <w:rPr>
+          <w:rFonts w:ascii="Times New Roman" w:hAnsi="Times New Roman"/>
+          <w:spacing w:val="-4"/>
+          <w:w w:val="99"/>
+          <w:sz w:val="24"/>
+          <w:szCs w:val="28"/>
+          <w:lang w:val="es-419"/>
+        </w:rPr>
+        <w:lastRenderedPageBreak/>
+        <w:t xml:space="preserve">exactly once (QoS 2). </w:t>
       </w:r>
     </w:p>
     <w:p>
@@ -4561,6 +4725,7 @@
           <w:szCs w:val="28"/>
           <w:lang w:val="es-419"/>
         </w:rPr>
+        <w:lastRenderedPageBreak/>
         <w:t>El firmware ejecuta la conexión en la función setup(), mediante la llamada a WiFi.begin(SSID, PASSWORD), seguida de un ciclo de espera que verifica el estado WiFi.status() != WL_CONNECTED con un intervalo de 500 ms entre verificaciones.</w:t>
       </w:r>
     </w:p>
@@ -5658,7 +5823,6 @@
           <w:szCs w:val="21"/>
           <w:lang w:eastAsia="en-US"/>
         </w:rPr>
-        <w:lastRenderedPageBreak/>
         <w:t xml:space="preserve">      </w:t>
       </w:r>
       <w:r>
@@ -7523,6 +7687,7 @@
           <w:szCs w:val="21"/>
           <w:lang w:eastAsia="en-US"/>
         </w:rPr>
+        <w:lastRenderedPageBreak/>
         <w:t>                     </w:t>
       </w:r>
       <w:r>
@@ -8368,18 +8533,7 @@
           <w:szCs w:val="28"/>
           <w:lang w:val="es-419"/>
         </w:rPr>
-        <w:t xml:space="preserve">El servidor backend, desarrollado en NodeJS y utilizando el framework Express, funciona como un cliente MQTT de alto nivel. Este servidor está suscrito a los tópicos de </w:t>
-      </w:r>
-      <w:r>
-        <w:rPr>
-          <w:rFonts w:ascii="Times New Roman" w:hAnsi="Times New Roman"/>
-          <w:w w:val="99"/>
-          <w:sz w:val="24"/>
-          <w:szCs w:val="28"/>
-          <w:lang w:val="es-419"/>
-        </w:rPr>
-        <w:lastRenderedPageBreak/>
-        <w:t xml:space="preserve">control y telemetría (sensor/data/#, device/register y control/led/#), actuando como puente entre el hardware y la interfaz de usuario. Actualmente, para validar la estabilidad del enlace, el ESP32 publica datos de telemetría simulados (valores </w:t>
+        <w:t xml:space="preserve">El servidor backend, desarrollado en NodeJS y utilizando el framework Express, funciona como un cliente MQTT de alto nivel. Este servidor está suscrito a los tópicos de control y telemetría (sensor/data/#, device/register y control/led/#), actuando como puente entre el hardware y la interfaz de usuario. Actualmente, para validar la estabilidad del enlace, el ESP32 publica datos de telemetría simulados (valores </w:t>
       </w:r>
       <w:r>
         <w:rPr>
@@ -9217,6 +9371,7 @@
           <w:szCs w:val="21"/>
           <w:lang w:eastAsia="en-US"/>
         </w:rPr>
+        <w:lastRenderedPageBreak/>
         <w:t xml:space="preserve">      </w:t>
       </w:r>
     </w:p>
@@ -10800,7 +10955,6 @@
           <w:szCs w:val="21"/>
           <w:lang w:eastAsia="en-US"/>
         </w:rPr>
-        <w:lastRenderedPageBreak/>
         <w:t>  });</w:t>
       </w:r>
     </w:p>
@@ -11075,7 +11229,7 @@
           <w:lang w:val="es-419"/>
         </w:rPr>
       </w:pPr>
-      <w:commentRangeStart w:id="5"/>
+      <w:commentRangeStart w:id="7"/>
       <w:r>
         <w:rPr>
           <w:rFonts w:ascii="Times New Roman" w:hAnsi="Times New Roman"/>
@@ -11088,7 +11242,7 @@
         </w:rPr>
         <w:t>Interfaz de usuario</w:t>
       </w:r>
-      <w:commentRangeEnd w:id="5"/>
+      <w:commentRangeEnd w:id="7"/>
       <w:r>
         <w:rPr>
           <w:rStyle w:val="CommentReference"/>
@@ -11100,7 +11254,7 @@
           <w:szCs w:val="24"/>
           <w:lang w:val="es-419"/>
         </w:rPr>
-        <w:commentReference w:id="5"/>
+        <w:commentReference w:id="7"/>
       </w:r>
     </w:p>
     <w:p>
@@ -11148,6 +11302,7 @@
         <w:rPr>
           <w:noProof/>
         </w:rPr>
+        <w:lastRenderedPageBreak/>
         <w:drawing>
           <wp:inline distT="0" distB="0" distL="0" distR="0" wp14:anchorId="380E19DA" wp14:editId="50351025">
             <wp:extent cx="2562225" cy="1747716"/>
@@ -11304,7 +11459,6 @@
         <w:rPr>
           <w:noProof/>
         </w:rPr>
-        <w:lastRenderedPageBreak/>
         <w:drawing>
           <wp:inline distT="0" distB="0" distL="0" distR="0" wp14:anchorId="08CD4657" wp14:editId="25C05D16">
             <wp:extent cx="3543300" cy="1550901"/>
@@ -11474,6 +11628,7 @@
         <w:rPr>
           <w:noProof/>
         </w:rPr>
+        <w:lastRenderedPageBreak/>
         <w:drawing>
           <wp:inline distT="0" distB="0" distL="0" distR="0" wp14:anchorId="752286AD" wp14:editId="519FEF4B">
             <wp:extent cx="4902624" cy="3101340"/>
@@ -11551,17 +11706,7 @@
           <w:szCs w:val="24"/>
           <w:lang w:val="es-419"/>
         </w:rPr>
-        <w:t xml:space="preserve">Para el desarrollo de la interfaz de usuario del proyecto se realizaron primero pruebas iniciales en Base44 con el objetivo de explorar ideas rápidas de estructura visual y definir cómo se presentaría la información dentro de la aplicación. Luego de esta etapa se decidió </w:t>
-      </w:r>
-      <w:r>
-        <w:rPr>
-          <w:rFonts w:ascii="Times New Roman" w:hAnsi="Times New Roman"/>
-          <w:sz w:val="24"/>
-          <w:szCs w:val="24"/>
-          <w:lang w:val="es-419"/>
-        </w:rPr>
-        <w:lastRenderedPageBreak/>
-        <w:t xml:space="preserve">continuar el diseño en Figma, ya que ofrece mayor control sobre la distribución visual, los componentes y la organización de cada pantalla, además de facilitar el proceso de convertir el diseño a código posteriormente. Durante esta fase el enfoque principal se ha concentrado en la pantalla </w:t>
+        <w:t xml:space="preserve">Para el desarrollo de la interfaz de usuario del proyecto se realizaron primero pruebas iniciales en Base44 con el objetivo de explorar ideas rápidas de estructura visual y definir cómo se presentaría la información dentro de la aplicación. Luego de esta etapa se decidió continuar el diseño en Figma, ya que ofrece mayor control sobre la distribución visual, los componentes y la organización de cada pantalla, además de facilitar el proceso de convertir el diseño a código posteriormente. Durante esta fase el enfoque principal se ha concentrado en la pantalla </w:t>
       </w:r>
       <w:r>
         <w:rPr>
@@ -11675,7 +11820,17 @@
           <w:szCs w:val="28"/>
           <w:lang w:val="es-419"/>
         </w:rPr>
-        <w:t>El desarrollo del proyecto ha permitido establecer una base funcional para un sistema IoT orientado al monitoreo y riego automatizado de plantas en entornos domésticos. Durante esta primera etapa se logró definir la arquitectura general del sistema, seleccionar las tecnologías de hardware y software adecuadas e implementar la comunicación entre el microcontrolador ESP32, el broker MQTT, el servidor backend y la base de datos. Estos avances confirman la viabilidad técnica del proyecto y permiten contar con una infraestructura capaz de transmitir información en tiempo real y mantener la comunicación entre los distintos componentes del sistema. De igual manera, el proceso de diseño de la interfaz permitió definir la estructura visual principal de la aplicación y establecer la pantalla Virtual Garden como el espacio central de monitoreo y control del usuario.</w:t>
+        <w:t xml:space="preserve">El desarrollo del proyecto ha permitido establecer una base funcional para un sistema IoT orientado al monitoreo y riego automatizado de plantas en entornos domésticos. Durante esta primera etapa se logró definir la arquitectura general del sistema, seleccionar las tecnologías de hardware y software adecuadas e implementar la comunicación entre el microcontrolador ESP32, el broker MQTT, el servidor backend y </w:t>
+      </w:r>
+      <w:r>
+        <w:rPr>
+          <w:rFonts w:ascii="Times New Roman" w:hAnsi="Times New Roman"/>
+          <w:sz w:val="24"/>
+          <w:szCs w:val="28"/>
+          <w:lang w:val="es-419"/>
+        </w:rPr>
+        <w:lastRenderedPageBreak/>
+        <w:t>la base de datos. Estos avances confirman la viabilidad técnica del proyecto y permiten contar con una infraestructura capaz de transmitir información en tiempo real y mantener la comunicación entre los distintos componentes del sistema. De igual manera, el proceso de diseño de la interfaz permitió definir la estructura visual principal de la aplicación y establecer la pantalla Virtual Garden como el espacio central de monitoreo y control del usuario.</w:t>
       </w:r>
     </w:p>
     <w:p>
@@ -11825,7 +11980,6 @@
           <w:szCs w:val="28"/>
           <w:lang w:val="es-419"/>
         </w:rPr>
-        <w:lastRenderedPageBreak/>
         <w:t xml:space="preserve">Angulo Martínez, W. A. (2025). Desarrollo e implementación de un sistema de riego inteligente basado en internet de las cosas para cultivos protegidos en Aguascalientes, México [Tesis de maestría, Universidad Autónoma de Aguascalientes]. 483563.pdf </w:t>
       </w:r>
     </w:p>
@@ -12117,7 +12271,19 @@
           <w:szCs w:val="28"/>
           <w:lang w:val="es-419"/>
         </w:rPr>
-        <w:t xml:space="preserve">Perea Alvarado, F. C., &amp; Bustamante Briones, G. A. (2024). Prototipo de sistema de riego automatizado con control de humedad por histéresis y monitoreo IoT para la reducción del recurso hídrico [Trabajo de titulación, Universidad Politécnica Salesiana]. </w:t>
+        <w:t xml:space="preserve">Perea Alvarado, F. C., &amp; Bustamante Briones, G. A. (2024). Prototipo de sistema de riego automatizado con control de humedad por histéresis y monitoreo IoT para la reducción del recurso hídrico [Trabajo de titulación, Universidad Politécnica </w:t>
+      </w:r>
+      <w:r>
+        <w:rPr>
+          <w:rFonts w:ascii="Times New Roman" w:hAnsi="Times New Roman"/>
+          <w:spacing w:val="-4"/>
+          <w:w w:val="99"/>
+          <w:sz w:val="24"/>
+          <w:szCs w:val="28"/>
+          <w:lang w:val="es-419"/>
+        </w:rPr>
+        <w:lastRenderedPageBreak/>
+        <w:t xml:space="preserve">Salesiana]. </w:t>
       </w:r>
       <w:hyperlink r:id="rId26" w:tgtFrame="_blank" w:history="1">
         <w:r>
@@ -12329,15 +12495,17 @@
           <w:w w:val="99"/>
           <w:sz w:val="24"/>
           <w:szCs w:val="28"/>
-        </w:rPr>
-      </w:pPr>
-      <w:r>
-        <w:rPr>
-          <w:rFonts w:ascii="Times New Roman" w:hAnsi="Times New Roman"/>
-          <w:spacing w:val="-4"/>
-          <w:w w:val="99"/>
-          <w:sz w:val="24"/>
-          <w:szCs w:val="28"/>
+          <w:lang w:val="es-419"/>
+        </w:rPr>
+      </w:pPr>
+      <w:r>
+        <w:rPr>
+          <w:rFonts w:ascii="Times New Roman" w:hAnsi="Times New Roman"/>
+          <w:spacing w:val="-4"/>
+          <w:w w:val="99"/>
+          <w:sz w:val="24"/>
+          <w:szCs w:val="28"/>
+          <w:lang w:val="es-419"/>
         </w:rPr>
         <w:t xml:space="preserve">Richard-Roman. (2026). RiegoJardin-ESP32. GitHub. </w:t>
       </w:r>
@@ -12350,6 +12518,7 @@
             <w:w w:val="99"/>
             <w:sz w:val="24"/>
             <w:szCs w:val="28"/>
+            <w:lang w:val="es-419"/>
           </w:rPr>
           <w:t>https://github.com/Richard-Roman/RiegoJardin-ESP32</w:t>
         </w:r>
@@ -12361,6 +12530,7 @@
           <w:w w:val="99"/>
           <w:sz w:val="24"/>
           <w:szCs w:val="28"/>
+          <w:lang w:val="es-419"/>
         </w:rPr>
         <w:t xml:space="preserve"> </w:t>
       </w:r>
@@ -12593,7 +12763,7 @@
         <w:annotationRef/>
       </w:r>
       <w:r>
-        <w:t>Agregar justificación</w:t>
+        <w:t>Agregar sección de justificación</w:t>
       </w:r>
     </w:p>
   </w:comment>
@@ -12646,7 +12816,7 @@
       </w:r>
     </w:p>
   </w:comment>
-  <w:comment w:id="3" w:author="[Est - IEC] Valenzuela Zorrilla, Axel Alexander" w:date="2026-06-01T18:47:00Z" w:initials="AV">
+  <w:comment w:id="4" w:author="[Est - IEC] Valenzuela Zorrilla, Axel Alexander" w:date="2026-06-06T12:40:00Z" w:initials="AV">
     <w:p>
       <w:pPr>
         <w:pStyle w:val="CommentText"/>
@@ -12659,11 +12829,11 @@
         <w:annotationRef/>
       </w:r>
       <w:r>
-        <w:t>Agregar justificación de mediciones de nutrientes</w:t>
+        <w:t>Agregar justificación de por qué usaremos todas estas mediciones</w:t>
       </w:r>
     </w:p>
   </w:comment>
-  <w:comment w:id="4" w:author="[Est - IEC] Valenzuela Zorrilla, Axel Alexander" w:date="2026-06-01T18:55:00Z" w:initials="AV">
+  <w:comment w:id="3" w:author="[Est - IEC] Valenzuela Zorrilla, Axel Alexander" w:date="2026-06-06T12:40:00Z" w:initials="AV">
     <w:p>
       <w:pPr>
         <w:pStyle w:val="CommentText"/>
@@ -12676,11 +12846,45 @@
         <w:annotationRef/>
       </w:r>
       <w:r>
+        <w:t>Agregar modelo específico del sensor</w:t>
+      </w:r>
+    </w:p>
+  </w:comment>
+  <w:comment w:id="5" w:author="[Est - IEC] Valenzuela Zorrilla, Axel Alexander" w:date="2026-06-06T12:41:00Z" w:initials="AV">
+    <w:p>
+      <w:pPr>
+        <w:pStyle w:val="CommentText"/>
+        <w:jc w:val="left"/>
+      </w:pPr>
+      <w:r>
+        <w:rPr>
+          <w:rStyle w:val="CommentReference"/>
+        </w:rPr>
+        <w:annotationRef/>
+      </w:r>
+      <w:r>
+        <w:t>Agregar modelo especifico de relé y bomba y justificar elección</w:t>
+      </w:r>
+    </w:p>
+  </w:comment>
+  <w:comment w:id="6" w:author="[Est - IEC] Valenzuela Zorrilla, Axel Alexander" w:date="2026-06-01T18:55:00Z" w:initials="AV">
+    <w:p>
+      <w:pPr>
+        <w:pStyle w:val="CommentText"/>
+        <w:jc w:val="left"/>
+      </w:pPr>
+      <w:r>
+        <w:rPr>
+          <w:rStyle w:val="CommentReference"/>
+        </w:rPr>
+        <w:annotationRef/>
+      </w:r>
+      <w:r>
         <w:t>Buscar cómo citar la imagen con su fuente original</w:t>
       </w:r>
     </w:p>
   </w:comment>
-  <w:comment w:id="5" w:author="[Est - IEC] Valenzuela Zorrilla, Axel Alexander" w:date="2026-06-01T19:12:00Z" w:initials="AV">
+  <w:comment w:id="7" w:author="[Est - IEC] Valenzuela Zorrilla, Axel Alexander" w:date="2026-06-01T19:12:00Z" w:initials="AV">
     <w:p>
       <w:pPr>
         <w:pStyle w:val="CommentText"/>
@@ -12702,10 +12906,12 @@
 
 <file path=word/commentsExtended.xml><?xml version="1.0" encoding="utf-8"?>
 <w15:commentsEx xmlns:wpc="http://schemas.microsoft.com/office/word/2010/wordprocessingCanvas" xmlns:cx="http://schemas.microsoft.com/office/drawing/2014/chartex" xmlns:cx1="http://schemas.microsoft.com/office/drawing/2015/9/8/chartex" xmlns:cx2="http://schemas.microsoft.com/office/drawing/2015/10/21/chartex" xmlns:cx3="http://schemas.microsoft.com/office/drawing/2016/5/9/chartex" xmlns:cx4="http://schemas.microsoft.com/office/drawing/2016/5/10/chartex" xmlns:cx5="http://schemas.microsoft.com/office/drawing/2016/5/11/chartex" xmlns:cx6="http://schemas.microsoft.com/office/drawing/2016/5/12/chartex" xmlns:cx7="http://schemas.microsoft.com/office/drawing/2016/5/13/chartex" xmlns:cx8="http://schemas.microsoft.com/office/drawing/2016/5/14/chartex" xmlns:mc="http://schemas.openxmlformats.org/markup-compatibility/2006" xmlns:aink="http://schemas.microsoft.com/office/drawing/2016/ink" xmlns:am3d="http://schemas.microsoft.com/office/drawing/2017/model3d" xmlns:o="urn:schemas-microsoft-com:office:office" xmlns:oel="http://schemas.microsoft.com/office/2019/extlst" xmlns:r="http://schemas.openxmlformats.org/officeDocument/2006/relationships" xmlns:m="http://schemas.openxmlformats.org/officeDocument/2006/math" xmlns:v="urn:schemas-microsoft-com:vml" xmlns:wp14="http://schemas.microsoft.com/office/word/2010/wordprocessingDrawing" xmlns:wp="http://schemas.openxmlformats.org/drawingml/2006/wordprocessingDrawing" xmlns:w10="urn:schemas-microsoft-com:office:word" xmlns:w="http://schemas.openxmlformats.org/wordprocessingml/2006/main" xmlns:w14="http://schemas.microsoft.com/office/word/2010/wordml" xmlns:w15="http://schemas.microsoft.com/office/word/2012/wordml" xmlns:w16cex="http://schemas.microsoft.com/office/word/2018/wordml/cex" xmlns:w16cid="http://schemas.microsoft.com/office/word/2016/wordml/cid" xmlns:w16="http://schemas.microsoft.com/office/word/2018/wordml" xmlns:w16du="http://schemas.microsoft.com/office/word/2023/wordml/word16du" xmlns:w16sdtdh="http://schemas.microsoft.com/office/word/2020/wordml/sdtdatahash" xmlns:w16sdtfl="http://schemas.microsoft.com/office/word/2024/wordml/sdtformatlock" xmlns:w16se="http://schemas.microsoft.com/office/word/2015/wordml/symex" xmlns:wpg="http://schemas.microsoft.com/office/word/2010/wordprocessingGroup" xmlns:wpi="http://schemas.microsoft.com/office/word/2010/wordprocessingInk" xmlns:wne="http://schemas.microsoft.com/office/word/2006/wordml" xmlns:wps="http://schemas.microsoft.com/office/word/2010/wordprocessingShape" mc:Ignorable="w14 w15 w16se w16cid w16 w16cex w16sdtdh w16sdtfl w16du wp14">
-  <w15:commentEx w15:paraId="410D8251" w15:done="0"/>
-  <w15:commentEx w15:paraId="2459C6A4" w15:done="0"/>
+  <w15:commentEx w15:paraId="410D8251" w15:done="1"/>
+  <w15:commentEx w15:paraId="2459C6A4" w15:done="1"/>
   <w15:commentEx w15:paraId="213A993B" w15:done="1"/>
-  <w15:commentEx w15:paraId="40BA952B" w15:done="0"/>
+  <w15:commentEx w15:paraId="6B4160A3" w15:done="0"/>
+  <w15:commentEx w15:paraId="34C54FB8" w15:done="0"/>
+  <w15:commentEx w15:paraId="3D2A6C82" w15:done="0"/>
   <w15:commentEx w15:paraId="49DABC8B" w15:done="1"/>
   <w15:commentEx w15:paraId="13F89575" w15:done="0"/>
 </w15:commentsEx>
@@ -12716,7 +12922,9 @@
   <w16cex:commentExtensible w16cex:durableId="02C1BF74" w16cex:dateUtc="2026-06-01T23:19:00Z"/>
   <w16cex:commentExtensible w16cex:durableId="41E88E00" w16cex:dateUtc="2026-06-01T23:34:00Z"/>
   <w16cex:commentExtensible w16cex:durableId="39F7D9A3" w16cex:dateUtc="2026-06-02T00:15:00Z"/>
-  <w16cex:commentExtensible w16cex:durableId="73961F80" w16cex:dateUtc="2026-06-01T22:47:00Z"/>
+  <w16cex:commentExtensible w16cex:durableId="3F5B4F75" w16cex:dateUtc="2026-06-06T16:40:00Z"/>
+  <w16cex:commentExtensible w16cex:durableId="3A3D99F3" w16cex:dateUtc="2026-06-06T16:40:00Z"/>
+  <w16cex:commentExtensible w16cex:durableId="2E4ECAD9" w16cex:dateUtc="2026-06-06T16:41:00Z"/>
   <w16cex:commentExtensible w16cex:durableId="2D8CCCAE" w16cex:dateUtc="2026-06-01T22:55:00Z"/>
   <w16cex:commentExtensible w16cex:durableId="2B300550" w16cex:dateUtc="2026-06-01T23:12:00Z"/>
 </w16cex:commentsExtensible>
@@ -12727,7 +12935,9 @@
   <w16cid:commentId w16cid:paraId="410D8251" w16cid:durableId="02C1BF74"/>
   <w16cid:commentId w16cid:paraId="2459C6A4" w16cid:durableId="41E88E00"/>
   <w16cid:commentId w16cid:paraId="213A993B" w16cid:durableId="39F7D9A3"/>
-  <w16cid:commentId w16cid:paraId="40BA952B" w16cid:durableId="73961F80"/>
+  <w16cid:commentId w16cid:paraId="6B4160A3" w16cid:durableId="3F5B4F75"/>
+  <w16cid:commentId w16cid:paraId="34C54FB8" w16cid:durableId="3A3D99F3"/>
+  <w16cid:commentId w16cid:paraId="3D2A6C82" w16cid:durableId="2E4ECAD9"/>
   <w16cid:commentId w16cid:paraId="49DABC8B" w16cid:durableId="2D8CCCAE"/>
   <w16cid:commentId w16cid:paraId="13F89575" w16cid:durableId="2B300550"/>
 </w16cid:commentsIds>

</xml_diff>